<commit_message>
feat(lab2): add conclusions and reflections to lab report
</commit_message>
<xml_diff>
--- a/Лаб2_IМ54_Бондаренко.docx
+++ b/Лаб2_IМ54_Бондаренко.docx
@@ -2013,8 +2013,9 @@
         <w:rPr>
           <w:rFonts w:ascii="Times New Roman" w:eastAsia="Times New Roman" w:hAnsi="Times New Roman" w:cs="Times New Roman"/>
           <w:color w:val="000000"/>
-          <w:sz w:val="26"/>
-          <w:szCs w:val="26"/>
+          <w:sz w:val="40"/>
+          <w:szCs w:val="40"/>
+          <w:lang w:val="uk-UA"/>
         </w:rPr>
       </w:pPr>
       <w:r>
@@ -2054,6 +2055,902 @@
           <w:szCs w:val="26"/>
         </w:rPr>
         <w:t>(Ж mod 2 = 0)</w:t>
+      </w:r>
+      <w:r>
+        <w:rPr>
+          <w:rFonts w:ascii="Times New Roman" w:eastAsia="Times New Roman" w:hAnsi="Times New Roman" w:cs="Times New Roman"/>
+          <w:color w:val="000000"/>
+          <w:sz w:val="26"/>
+          <w:szCs w:val="26"/>
+        </w:rPr>
+        <w:br/>
+      </w:r>
+      <w:r>
+        <w:rPr>
+          <w:rFonts w:ascii="Times New Roman" w:eastAsia="Times New Roman" w:hAnsi="Times New Roman" w:cs="Times New Roman"/>
+          <w:color w:val="000000"/>
+          <w:sz w:val="26"/>
+          <w:szCs w:val="26"/>
+        </w:rPr>
+        <w:br/>
+      </w:r>
+      <w:r>
+        <w:rPr>
+          <w:rFonts w:ascii="Times New Roman" w:eastAsia="Times New Roman" w:hAnsi="Times New Roman" w:cs="Times New Roman"/>
+          <w:color w:val="000000"/>
+          <w:sz w:val="26"/>
+          <w:szCs w:val="26"/>
+        </w:rPr>
+        <w:br/>
+      </w:r>
+      <w:r>
+        <w:rPr>
+          <w:rFonts w:ascii="Times New Roman" w:eastAsia="Times New Roman" w:hAnsi="Times New Roman" w:cs="Times New Roman"/>
+          <w:color w:val="000000"/>
+          <w:sz w:val="26"/>
+          <w:szCs w:val="26"/>
+        </w:rPr>
+        <w:br/>
+      </w:r>
+      <w:r>
+        <w:rPr>
+          <w:rFonts w:ascii="Times New Roman" w:eastAsia="Times New Roman" w:hAnsi="Times New Roman" w:cs="Times New Roman"/>
+          <w:color w:val="000000"/>
+          <w:sz w:val="26"/>
+          <w:szCs w:val="26"/>
+        </w:rPr>
+        <w:br/>
+      </w:r>
+      <w:r>
+        <w:rPr>
+          <w:rFonts w:ascii="Times New Roman" w:eastAsia="Times New Roman" w:hAnsi="Times New Roman" w:cs="Times New Roman"/>
+          <w:color w:val="000000"/>
+          <w:sz w:val="26"/>
+          <w:szCs w:val="26"/>
+        </w:rPr>
+        <w:br/>
+      </w:r>
+      <w:r>
+        <w:rPr>
+          <w:rFonts w:ascii="Times New Roman" w:eastAsia="Times New Roman" w:hAnsi="Times New Roman" w:cs="Times New Roman"/>
+          <w:b/>
+          <w:bCs/>
+          <w:color w:val="0D0D0D" w:themeColor="text2" w:themeTint="F2"/>
+          <w:sz w:val="40"/>
+          <w:szCs w:val="40"/>
+          <w:u w:val="single"/>
+          <w:lang w:val="uk-UA"/>
+        </w:rPr>
+        <w:lastRenderedPageBreak/>
+        <w:t>Код програм</w:t>
+      </w:r>
+      <w:r>
+        <w:rPr>
+          <w:rFonts w:ascii="Times New Roman" w:eastAsia="Times New Roman" w:hAnsi="Times New Roman" w:cs="Times New Roman"/>
+          <w:color w:val="0D0D0D" w:themeColor="text2" w:themeTint="F2"/>
+          <w:sz w:val="40"/>
+          <w:szCs w:val="40"/>
+          <w:lang w:val="uk-UA"/>
+        </w:rPr>
+        <w:t xml:space="preserve"> </w:t>
+      </w:r>
+      <w:r>
+        <w:rPr>
+          <w:rFonts w:ascii="Times New Roman" w:eastAsia="Times New Roman" w:hAnsi="Times New Roman" w:cs="Times New Roman"/>
+          <w:color w:val="000000"/>
+          <w:sz w:val="40"/>
+          <w:szCs w:val="40"/>
+          <w:lang w:val="uk-UA"/>
+        </w:rPr>
+        <w:t xml:space="preserve">зручніше дивитись на </w:t>
+      </w:r>
+      <w:hyperlink r:id="rId5" w:history="1">
+        <w:r>
+          <w:rPr>
+            <w:rStyle w:val="a8"/>
+            <w:rFonts w:ascii="Times New Roman" w:eastAsia="Times New Roman" w:hAnsi="Times New Roman" w:cs="Times New Roman"/>
+            <w:sz w:val="40"/>
+            <w:szCs w:val="40"/>
+          </w:rPr>
+          <w:t>gith</w:t>
+        </w:r>
+        <w:r>
+          <w:rPr>
+            <w:rStyle w:val="a8"/>
+            <w:rFonts w:ascii="Times New Roman" w:eastAsia="Times New Roman" w:hAnsi="Times New Roman" w:cs="Times New Roman"/>
+            <w:sz w:val="40"/>
+            <w:szCs w:val="40"/>
+          </w:rPr>
+          <w:t>u</w:t>
+        </w:r>
+        <w:r>
+          <w:rPr>
+            <w:rStyle w:val="a8"/>
+            <w:rFonts w:ascii="Times New Roman" w:eastAsia="Times New Roman" w:hAnsi="Times New Roman" w:cs="Times New Roman"/>
+            <w:sz w:val="40"/>
+            <w:szCs w:val="40"/>
+          </w:rPr>
+          <w:t>b</w:t>
+        </w:r>
+      </w:hyperlink>
+      <w:r>
+        <w:rPr>
+          <w:rFonts w:ascii="Times New Roman" w:eastAsia="Times New Roman" w:hAnsi="Times New Roman" w:cs="Times New Roman"/>
+          <w:color w:val="000000"/>
+          <w:sz w:val="40"/>
+          <w:szCs w:val="40"/>
+          <w:lang w:val="uk-UA"/>
+        </w:rPr>
+        <w:t>.</w:t>
+      </w:r>
+    </w:p>
+    <w:p>
+      <w:pPr>
+        <w:rPr>
+          <w:rFonts w:ascii="Times New Roman" w:eastAsia="Times New Roman" w:hAnsi="Times New Roman" w:cs="Times New Roman"/>
+          <w:b/>
+          <w:bCs/>
+          <w:color w:val="000000"/>
+          <w:sz w:val="40"/>
+          <w:szCs w:val="40"/>
+          <w:u w:val="single"/>
+          <w:lang w:val="uk-UA"/>
+        </w:rPr>
+      </w:pPr>
+      <w:r>
+        <w:rPr>
+          <w:rFonts w:ascii="Times New Roman" w:eastAsia="Times New Roman" w:hAnsi="Times New Roman" w:cs="Times New Roman"/>
+          <w:b/>
+          <w:bCs/>
+          <w:color w:val="000000"/>
+          <w:sz w:val="40"/>
+          <w:szCs w:val="40"/>
+          <w:u w:val="single"/>
+          <w:lang w:val="uk-UA"/>
+        </w:rPr>
+        <w:t>Скріншоти:</w:t>
+      </w:r>
+    </w:p>
+    <w:p>
+      <w:pPr>
+        <w:rPr>
+          <w:rFonts w:ascii="Times New Roman" w:eastAsia="Times New Roman" w:hAnsi="Times New Roman" w:cs="Times New Roman"/>
+          <w:color w:val="000000"/>
+          <w:sz w:val="26"/>
+          <w:szCs w:val="26"/>
+          <w:lang w:val="uk-UA"/>
+        </w:rPr>
+      </w:pPr>
+      <w:r>
+        <w:rPr>
+          <w:rFonts w:ascii="Times New Roman" w:eastAsia="Times New Roman" w:hAnsi="Times New Roman" w:cs="Times New Roman"/>
+          <w:noProof/>
+          <w:color w:val="000000"/>
+          <w:sz w:val="26"/>
+          <w:szCs w:val="26"/>
+          <w:lang w:val="uk-UA"/>
+        </w:rPr>
+        <w:drawing>
+          <wp:inline distT="0" distB="0" distL="0" distR="0" wp14:anchorId="7D530EE9" wp14:editId="650F1B74">
+            <wp:extent cx="5936615" cy="5213350"/>
+            <wp:effectExtent l="0" t="0" r="6985" b="6350"/>
+            <wp:docPr id="11" name="Рисунок 11"/>
+            <wp:cNvGraphicFramePr>
+              <a:graphicFrameLocks xmlns:a="http://schemas.openxmlformats.org/drawingml/2006/main" noChangeAspect="1"/>
+            </wp:cNvGraphicFramePr>
+            <a:graphic xmlns:a="http://schemas.openxmlformats.org/drawingml/2006/main">
+              <a:graphicData uri="http://schemas.openxmlformats.org/drawingml/2006/picture">
+                <pic:pic xmlns:pic="http://schemas.openxmlformats.org/drawingml/2006/picture">
+                  <pic:nvPicPr>
+                    <pic:cNvPr id="0" name="Picture 137"/>
+                    <pic:cNvPicPr>
+                      <a:picLocks noChangeAspect="1" noChangeArrowheads="1"/>
+                    </pic:cNvPicPr>
+                  </pic:nvPicPr>
+                  <pic:blipFill>
+                    <a:blip r:embed="rId6">
+                      <a:extLst>
+                        <a:ext uri="{28A0092B-C50C-407E-A947-70E740481C1C}">
+                          <a14:useLocalDpi xmlns:a14="http://schemas.microsoft.com/office/drawing/2010/main" val="0"/>
+                        </a:ext>
+                      </a:extLst>
+                    </a:blip>
+                    <a:srcRect/>
+                    <a:stretch>
+                      <a:fillRect/>
+                    </a:stretch>
+                  </pic:blipFill>
+                  <pic:spPr bwMode="auto">
+                    <a:xfrm>
+                      <a:off x="0" y="0"/>
+                      <a:ext cx="5936615" cy="5213350"/>
+                    </a:xfrm>
+                    <a:prstGeom prst="rect">
+                      <a:avLst/>
+                    </a:prstGeom>
+                    <a:noFill/>
+                    <a:ln>
+                      <a:noFill/>
+                    </a:ln>
+                  </pic:spPr>
+                </pic:pic>
+              </a:graphicData>
+            </a:graphic>
+          </wp:inline>
+        </w:drawing>
+      </w:r>
+      <w:r>
+        <w:rPr>
+          <w:rFonts w:ascii="Times New Roman" w:eastAsia="Times New Roman" w:hAnsi="Times New Roman" w:cs="Times New Roman"/>
+          <w:noProof/>
+          <w:color w:val="000000"/>
+          <w:sz w:val="26"/>
+          <w:szCs w:val="26"/>
+          <w:lang w:val="uk-UA"/>
+        </w:rPr>
+        <w:lastRenderedPageBreak/>
+        <w:drawing>
+          <wp:inline distT="0" distB="0" distL="0" distR="0" wp14:anchorId="1F1F2275" wp14:editId="489E86FE">
+            <wp:extent cx="5936615" cy="5186045"/>
+            <wp:effectExtent l="0" t="0" r="6985" b="0"/>
+            <wp:docPr id="12" name="Рисунок 12"/>
+            <wp:cNvGraphicFramePr>
+              <a:graphicFrameLocks xmlns:a="http://schemas.openxmlformats.org/drawingml/2006/main" noChangeAspect="1"/>
+            </wp:cNvGraphicFramePr>
+            <a:graphic xmlns:a="http://schemas.openxmlformats.org/drawingml/2006/main">
+              <a:graphicData uri="http://schemas.openxmlformats.org/drawingml/2006/picture">
+                <pic:pic xmlns:pic="http://schemas.openxmlformats.org/drawingml/2006/picture">
+                  <pic:nvPicPr>
+                    <pic:cNvPr id="0" name="Picture 138"/>
+                    <pic:cNvPicPr>
+                      <a:picLocks noChangeAspect="1" noChangeArrowheads="1"/>
+                    </pic:cNvPicPr>
+                  </pic:nvPicPr>
+                  <pic:blipFill>
+                    <a:blip r:embed="rId7">
+                      <a:extLst>
+                        <a:ext uri="{28A0092B-C50C-407E-A947-70E740481C1C}">
+                          <a14:useLocalDpi xmlns:a14="http://schemas.microsoft.com/office/drawing/2010/main" val="0"/>
+                        </a:ext>
+                      </a:extLst>
+                    </a:blip>
+                    <a:srcRect/>
+                    <a:stretch>
+                      <a:fillRect/>
+                    </a:stretch>
+                  </pic:blipFill>
+                  <pic:spPr bwMode="auto">
+                    <a:xfrm>
+                      <a:off x="0" y="0"/>
+                      <a:ext cx="5936615" cy="5186045"/>
+                    </a:xfrm>
+                    <a:prstGeom prst="rect">
+                      <a:avLst/>
+                    </a:prstGeom>
+                    <a:noFill/>
+                    <a:ln>
+                      <a:noFill/>
+                    </a:ln>
+                  </pic:spPr>
+                </pic:pic>
+              </a:graphicData>
+            </a:graphic>
+          </wp:inline>
+        </w:drawing>
+      </w:r>
+      <w:r>
+        <w:rPr>
+          <w:rFonts w:ascii="Times New Roman" w:eastAsia="Times New Roman" w:hAnsi="Times New Roman" w:cs="Times New Roman"/>
+          <w:noProof/>
+          <w:color w:val="000000"/>
+          <w:sz w:val="26"/>
+          <w:szCs w:val="26"/>
+          <w:lang w:val="uk-UA"/>
+        </w:rPr>
+        <w:lastRenderedPageBreak/>
+        <w:drawing>
+          <wp:inline distT="0" distB="0" distL="0" distR="0" wp14:anchorId="6CF9EB96" wp14:editId="1540EF20">
+            <wp:extent cx="5936615" cy="5227320"/>
+            <wp:effectExtent l="0" t="0" r="6985" b="0"/>
+            <wp:docPr id="13" name="Рисунок 13"/>
+            <wp:cNvGraphicFramePr>
+              <a:graphicFrameLocks xmlns:a="http://schemas.openxmlformats.org/drawingml/2006/main" noChangeAspect="1"/>
+            </wp:cNvGraphicFramePr>
+            <a:graphic xmlns:a="http://schemas.openxmlformats.org/drawingml/2006/main">
+              <a:graphicData uri="http://schemas.openxmlformats.org/drawingml/2006/picture">
+                <pic:pic xmlns:pic="http://schemas.openxmlformats.org/drawingml/2006/picture">
+                  <pic:nvPicPr>
+                    <pic:cNvPr id="0" name="Picture 139"/>
+                    <pic:cNvPicPr>
+                      <a:picLocks noChangeAspect="1" noChangeArrowheads="1"/>
+                    </pic:cNvPicPr>
+                  </pic:nvPicPr>
+                  <pic:blipFill>
+                    <a:blip r:embed="rId8">
+                      <a:extLst>
+                        <a:ext uri="{28A0092B-C50C-407E-A947-70E740481C1C}">
+                          <a14:useLocalDpi xmlns:a14="http://schemas.microsoft.com/office/drawing/2010/main" val="0"/>
+                        </a:ext>
+                      </a:extLst>
+                    </a:blip>
+                    <a:srcRect/>
+                    <a:stretch>
+                      <a:fillRect/>
+                    </a:stretch>
+                  </pic:blipFill>
+                  <pic:spPr bwMode="auto">
+                    <a:xfrm>
+                      <a:off x="0" y="0"/>
+                      <a:ext cx="5936615" cy="5227320"/>
+                    </a:xfrm>
+                    <a:prstGeom prst="rect">
+                      <a:avLst/>
+                    </a:prstGeom>
+                    <a:noFill/>
+                    <a:ln>
+                      <a:noFill/>
+                    </a:ln>
+                  </pic:spPr>
+                </pic:pic>
+              </a:graphicData>
+            </a:graphic>
+          </wp:inline>
+        </w:drawing>
+      </w:r>
+      <w:r>
+        <w:rPr>
+          <w:rFonts w:ascii="Times New Roman" w:eastAsia="Times New Roman" w:hAnsi="Times New Roman" w:cs="Times New Roman"/>
+          <w:noProof/>
+          <w:color w:val="000000"/>
+          <w:sz w:val="26"/>
+          <w:szCs w:val="26"/>
+          <w:lang w:val="uk-UA"/>
+        </w:rPr>
+        <w:lastRenderedPageBreak/>
+        <w:drawing>
+          <wp:inline distT="0" distB="0" distL="0" distR="0" wp14:anchorId="1E88B41D" wp14:editId="6EB19B41">
+            <wp:extent cx="5936615" cy="5186045"/>
+            <wp:effectExtent l="0" t="0" r="6985" b="0"/>
+            <wp:docPr id="14" name="Рисунок 14"/>
+            <wp:cNvGraphicFramePr>
+              <a:graphicFrameLocks xmlns:a="http://schemas.openxmlformats.org/drawingml/2006/main" noChangeAspect="1"/>
+            </wp:cNvGraphicFramePr>
+            <a:graphic xmlns:a="http://schemas.openxmlformats.org/drawingml/2006/main">
+              <a:graphicData uri="http://schemas.openxmlformats.org/drawingml/2006/picture">
+                <pic:pic xmlns:pic="http://schemas.openxmlformats.org/drawingml/2006/picture">
+                  <pic:nvPicPr>
+                    <pic:cNvPr id="0" name="Picture 140"/>
+                    <pic:cNvPicPr>
+                      <a:picLocks noChangeAspect="1" noChangeArrowheads="1"/>
+                    </pic:cNvPicPr>
+                  </pic:nvPicPr>
+                  <pic:blipFill>
+                    <a:blip r:embed="rId9">
+                      <a:extLst>
+                        <a:ext uri="{28A0092B-C50C-407E-A947-70E740481C1C}">
+                          <a14:useLocalDpi xmlns:a14="http://schemas.microsoft.com/office/drawing/2010/main" val="0"/>
+                        </a:ext>
+                      </a:extLst>
+                    </a:blip>
+                    <a:srcRect/>
+                    <a:stretch>
+                      <a:fillRect/>
+                    </a:stretch>
+                  </pic:blipFill>
+                  <pic:spPr bwMode="auto">
+                    <a:xfrm>
+                      <a:off x="0" y="0"/>
+                      <a:ext cx="5936615" cy="5186045"/>
+                    </a:xfrm>
+                    <a:prstGeom prst="rect">
+                      <a:avLst/>
+                    </a:prstGeom>
+                    <a:noFill/>
+                    <a:ln>
+                      <a:noFill/>
+                    </a:ln>
+                  </pic:spPr>
+                </pic:pic>
+              </a:graphicData>
+            </a:graphic>
+          </wp:inline>
+        </w:drawing>
+      </w:r>
+      <w:r>
+        <w:rPr>
+          <w:rFonts w:ascii="Times New Roman" w:eastAsia="Times New Roman" w:hAnsi="Times New Roman" w:cs="Times New Roman"/>
+          <w:noProof/>
+          <w:color w:val="000000"/>
+          <w:sz w:val="26"/>
+          <w:szCs w:val="26"/>
+          <w:lang w:val="uk-UA"/>
+        </w:rPr>
+        <w:lastRenderedPageBreak/>
+        <w:drawing>
+          <wp:inline distT="0" distB="0" distL="0" distR="0" wp14:anchorId="0978829E" wp14:editId="51233090">
+            <wp:extent cx="5936615" cy="5200015"/>
+            <wp:effectExtent l="0" t="0" r="6985" b="635"/>
+            <wp:docPr id="15" name="Рисунок 15"/>
+            <wp:cNvGraphicFramePr>
+              <a:graphicFrameLocks xmlns:a="http://schemas.openxmlformats.org/drawingml/2006/main" noChangeAspect="1"/>
+            </wp:cNvGraphicFramePr>
+            <a:graphic xmlns:a="http://schemas.openxmlformats.org/drawingml/2006/main">
+              <a:graphicData uri="http://schemas.openxmlformats.org/drawingml/2006/picture">
+                <pic:pic xmlns:pic="http://schemas.openxmlformats.org/drawingml/2006/picture">
+                  <pic:nvPicPr>
+                    <pic:cNvPr id="0" name="Picture 141"/>
+                    <pic:cNvPicPr>
+                      <a:picLocks noChangeAspect="1" noChangeArrowheads="1"/>
+                    </pic:cNvPicPr>
+                  </pic:nvPicPr>
+                  <pic:blipFill>
+                    <a:blip r:embed="rId10">
+                      <a:extLst>
+                        <a:ext uri="{28A0092B-C50C-407E-A947-70E740481C1C}">
+                          <a14:useLocalDpi xmlns:a14="http://schemas.microsoft.com/office/drawing/2010/main" val="0"/>
+                        </a:ext>
+                      </a:extLst>
+                    </a:blip>
+                    <a:srcRect/>
+                    <a:stretch>
+                      <a:fillRect/>
+                    </a:stretch>
+                  </pic:blipFill>
+                  <pic:spPr bwMode="auto">
+                    <a:xfrm>
+                      <a:off x="0" y="0"/>
+                      <a:ext cx="5936615" cy="5200015"/>
+                    </a:xfrm>
+                    <a:prstGeom prst="rect">
+                      <a:avLst/>
+                    </a:prstGeom>
+                    <a:noFill/>
+                    <a:ln>
+                      <a:noFill/>
+                    </a:ln>
+                  </pic:spPr>
+                </pic:pic>
+              </a:graphicData>
+            </a:graphic>
+          </wp:inline>
+        </w:drawing>
+      </w:r>
+      <w:r>
+        <w:rPr>
+          <w:rFonts w:ascii="Times New Roman" w:eastAsia="Times New Roman" w:hAnsi="Times New Roman" w:cs="Times New Roman"/>
+          <w:noProof/>
+          <w:color w:val="000000"/>
+          <w:sz w:val="26"/>
+          <w:szCs w:val="26"/>
+          <w:lang w:val="uk-UA"/>
+        </w:rPr>
+        <w:lastRenderedPageBreak/>
+        <w:drawing>
+          <wp:inline distT="0" distB="0" distL="0" distR="0" wp14:anchorId="2FE21CE1" wp14:editId="31424749">
+            <wp:extent cx="5936615" cy="5118100"/>
+            <wp:effectExtent l="0" t="0" r="6985" b="6350"/>
+            <wp:docPr id="16" name="Рисунок 16"/>
+            <wp:cNvGraphicFramePr>
+              <a:graphicFrameLocks xmlns:a="http://schemas.openxmlformats.org/drawingml/2006/main" noChangeAspect="1"/>
+            </wp:cNvGraphicFramePr>
+            <a:graphic xmlns:a="http://schemas.openxmlformats.org/drawingml/2006/main">
+              <a:graphicData uri="http://schemas.openxmlformats.org/drawingml/2006/picture">
+                <pic:pic xmlns:pic="http://schemas.openxmlformats.org/drawingml/2006/picture">
+                  <pic:nvPicPr>
+                    <pic:cNvPr id="0" name="Picture 142"/>
+                    <pic:cNvPicPr>
+                      <a:picLocks noChangeAspect="1" noChangeArrowheads="1"/>
+                    </pic:cNvPicPr>
+                  </pic:nvPicPr>
+                  <pic:blipFill>
+                    <a:blip r:embed="rId11">
+                      <a:extLst>
+                        <a:ext uri="{28A0092B-C50C-407E-A947-70E740481C1C}">
+                          <a14:useLocalDpi xmlns:a14="http://schemas.microsoft.com/office/drawing/2010/main" val="0"/>
+                        </a:ext>
+                      </a:extLst>
+                    </a:blip>
+                    <a:srcRect/>
+                    <a:stretch>
+                      <a:fillRect/>
+                    </a:stretch>
+                  </pic:blipFill>
+                  <pic:spPr bwMode="auto">
+                    <a:xfrm>
+                      <a:off x="0" y="0"/>
+                      <a:ext cx="5936615" cy="5118100"/>
+                    </a:xfrm>
+                    <a:prstGeom prst="rect">
+                      <a:avLst/>
+                    </a:prstGeom>
+                    <a:noFill/>
+                    <a:ln>
+                      <a:noFill/>
+                    </a:ln>
+                  </pic:spPr>
+                </pic:pic>
+              </a:graphicData>
+            </a:graphic>
+          </wp:inline>
+        </w:drawing>
+      </w:r>
+      <w:r>
+        <w:rPr>
+          <w:rFonts w:ascii="Times New Roman" w:eastAsia="Times New Roman" w:hAnsi="Times New Roman" w:cs="Times New Roman"/>
+          <w:noProof/>
+          <w:color w:val="000000"/>
+          <w:sz w:val="26"/>
+          <w:szCs w:val="26"/>
+          <w:lang w:val="uk-UA"/>
+        </w:rPr>
+        <w:lastRenderedPageBreak/>
+        <w:drawing>
+          <wp:inline distT="0" distB="0" distL="0" distR="0" wp14:anchorId="43B80084" wp14:editId="0C6868AF">
+            <wp:extent cx="5936615" cy="5200015"/>
+            <wp:effectExtent l="0" t="0" r="6985" b="635"/>
+            <wp:docPr id="17" name="Рисунок 17"/>
+            <wp:cNvGraphicFramePr>
+              <a:graphicFrameLocks xmlns:a="http://schemas.openxmlformats.org/drawingml/2006/main" noChangeAspect="1"/>
+            </wp:cNvGraphicFramePr>
+            <a:graphic xmlns:a="http://schemas.openxmlformats.org/drawingml/2006/main">
+              <a:graphicData uri="http://schemas.openxmlformats.org/drawingml/2006/picture">
+                <pic:pic xmlns:pic="http://schemas.openxmlformats.org/drawingml/2006/picture">
+                  <pic:nvPicPr>
+                    <pic:cNvPr id="0" name="Picture 143"/>
+                    <pic:cNvPicPr>
+                      <a:picLocks noChangeAspect="1" noChangeArrowheads="1"/>
+                    </pic:cNvPicPr>
+                  </pic:nvPicPr>
+                  <pic:blipFill>
+                    <a:blip r:embed="rId12">
+                      <a:extLst>
+                        <a:ext uri="{28A0092B-C50C-407E-A947-70E740481C1C}">
+                          <a14:useLocalDpi xmlns:a14="http://schemas.microsoft.com/office/drawing/2010/main" val="0"/>
+                        </a:ext>
+                      </a:extLst>
+                    </a:blip>
+                    <a:srcRect/>
+                    <a:stretch>
+                      <a:fillRect/>
+                    </a:stretch>
+                  </pic:blipFill>
+                  <pic:spPr bwMode="auto">
+                    <a:xfrm>
+                      <a:off x="0" y="0"/>
+                      <a:ext cx="5936615" cy="5200015"/>
+                    </a:xfrm>
+                    <a:prstGeom prst="rect">
+                      <a:avLst/>
+                    </a:prstGeom>
+                    <a:noFill/>
+                    <a:ln>
+                      <a:noFill/>
+                    </a:ln>
+                  </pic:spPr>
+                </pic:pic>
+              </a:graphicData>
+            </a:graphic>
+          </wp:inline>
+        </w:drawing>
+      </w:r>
+      <w:r>
+        <w:rPr>
+          <w:rFonts w:ascii="Times New Roman" w:eastAsia="Times New Roman" w:hAnsi="Times New Roman" w:cs="Times New Roman"/>
+          <w:noProof/>
+          <w:color w:val="000000"/>
+          <w:sz w:val="26"/>
+          <w:szCs w:val="26"/>
+          <w:lang w:val="uk-UA"/>
+        </w:rPr>
+        <w:lastRenderedPageBreak/>
+        <w:drawing>
+          <wp:inline distT="0" distB="0" distL="0" distR="0" wp14:anchorId="6187C733" wp14:editId="1F51800C">
+            <wp:extent cx="5936615" cy="5022215"/>
+            <wp:effectExtent l="0" t="0" r="6985" b="6985"/>
+            <wp:docPr id="18" name="Рисунок 18"/>
+            <wp:cNvGraphicFramePr>
+              <a:graphicFrameLocks xmlns:a="http://schemas.openxmlformats.org/drawingml/2006/main" noChangeAspect="1"/>
+            </wp:cNvGraphicFramePr>
+            <a:graphic xmlns:a="http://schemas.openxmlformats.org/drawingml/2006/main">
+              <a:graphicData uri="http://schemas.openxmlformats.org/drawingml/2006/picture">
+                <pic:pic xmlns:pic="http://schemas.openxmlformats.org/drawingml/2006/picture">
+                  <pic:nvPicPr>
+                    <pic:cNvPr id="0" name="Picture 144"/>
+                    <pic:cNvPicPr>
+                      <a:picLocks noChangeAspect="1" noChangeArrowheads="1"/>
+                    </pic:cNvPicPr>
+                  </pic:nvPicPr>
+                  <pic:blipFill>
+                    <a:blip r:embed="rId13">
+                      <a:extLst>
+                        <a:ext uri="{28A0092B-C50C-407E-A947-70E740481C1C}">
+                          <a14:useLocalDpi xmlns:a14="http://schemas.microsoft.com/office/drawing/2010/main" val="0"/>
+                        </a:ext>
+                      </a:extLst>
+                    </a:blip>
+                    <a:srcRect/>
+                    <a:stretch>
+                      <a:fillRect/>
+                    </a:stretch>
+                  </pic:blipFill>
+                  <pic:spPr bwMode="auto">
+                    <a:xfrm>
+                      <a:off x="0" y="0"/>
+                      <a:ext cx="5936615" cy="5022215"/>
+                    </a:xfrm>
+                    <a:prstGeom prst="rect">
+                      <a:avLst/>
+                    </a:prstGeom>
+                    <a:noFill/>
+                    <a:ln>
+                      <a:noFill/>
+                    </a:ln>
+                  </pic:spPr>
+                </pic:pic>
+              </a:graphicData>
+            </a:graphic>
+          </wp:inline>
+        </w:drawing>
+      </w:r>
+      <w:r>
+        <w:rPr>
+          <w:rFonts w:ascii="Times New Roman" w:eastAsia="Times New Roman" w:hAnsi="Times New Roman" w:cs="Times New Roman"/>
+          <w:noProof/>
+          <w:color w:val="000000"/>
+          <w:sz w:val="26"/>
+          <w:szCs w:val="26"/>
+          <w:lang w:val="uk-UA"/>
+        </w:rPr>
+        <w:lastRenderedPageBreak/>
+        <w:drawing>
+          <wp:inline distT="0" distB="0" distL="0" distR="0" wp14:anchorId="3E85E522" wp14:editId="2A0F93D8">
+            <wp:extent cx="5936615" cy="5254625"/>
+            <wp:effectExtent l="0" t="0" r="6985" b="3175"/>
+            <wp:docPr id="19" name="Рисунок 19"/>
+            <wp:cNvGraphicFramePr>
+              <a:graphicFrameLocks xmlns:a="http://schemas.openxmlformats.org/drawingml/2006/main" noChangeAspect="1"/>
+            </wp:cNvGraphicFramePr>
+            <a:graphic xmlns:a="http://schemas.openxmlformats.org/drawingml/2006/main">
+              <a:graphicData uri="http://schemas.openxmlformats.org/drawingml/2006/picture">
+                <pic:pic xmlns:pic="http://schemas.openxmlformats.org/drawingml/2006/picture">
+                  <pic:nvPicPr>
+                    <pic:cNvPr id="0" name="Picture 145"/>
+                    <pic:cNvPicPr>
+                      <a:picLocks noChangeAspect="1" noChangeArrowheads="1"/>
+                    </pic:cNvPicPr>
+                  </pic:nvPicPr>
+                  <pic:blipFill>
+                    <a:blip r:embed="rId14">
+                      <a:extLst>
+                        <a:ext uri="{28A0092B-C50C-407E-A947-70E740481C1C}">
+                          <a14:useLocalDpi xmlns:a14="http://schemas.microsoft.com/office/drawing/2010/main" val="0"/>
+                        </a:ext>
+                      </a:extLst>
+                    </a:blip>
+                    <a:srcRect/>
+                    <a:stretch>
+                      <a:fillRect/>
+                    </a:stretch>
+                  </pic:blipFill>
+                  <pic:spPr bwMode="auto">
+                    <a:xfrm>
+                      <a:off x="0" y="0"/>
+                      <a:ext cx="5936615" cy="5254625"/>
+                    </a:xfrm>
+                    <a:prstGeom prst="rect">
+                      <a:avLst/>
+                    </a:prstGeom>
+                    <a:noFill/>
+                    <a:ln>
+                      <a:noFill/>
+                    </a:ln>
+                  </pic:spPr>
+                </pic:pic>
+              </a:graphicData>
+            </a:graphic>
+          </wp:inline>
+        </w:drawing>
+      </w:r>
+    </w:p>
+    <w:p>
+      <w:pPr>
+        <w:widowControl/>
+        <w:rPr>
+          <w:rFonts w:ascii="Times New Roman" w:eastAsia="Times New Roman" w:hAnsi="Times New Roman" w:cs="Times New Roman"/>
+          <w:color w:val="000000"/>
+          <w:sz w:val="26"/>
+          <w:szCs w:val="26"/>
+          <w:lang w:val="uk-UA"/>
+        </w:rPr>
+      </w:pPr>
+      <w:r>
+        <w:rPr>
+          <w:rFonts w:ascii="Times New Roman" w:eastAsia="Times New Roman" w:hAnsi="Times New Roman" w:cs="Times New Roman"/>
+          <w:color w:val="000000"/>
+          <w:sz w:val="26"/>
+          <w:szCs w:val="26"/>
+          <w:lang w:val="uk-UA"/>
+        </w:rPr>
+        <w:br w:type="page"/>
+      </w:r>
+    </w:p>
+    <w:p>
+      <w:pPr>
+        <w:rPr>
+          <w:rFonts w:ascii="Times New Roman" w:eastAsia="Times New Roman" w:hAnsi="Times New Roman" w:cs="Times New Roman"/>
+          <w:color w:val="000000"/>
+          <w:sz w:val="26"/>
+          <w:szCs w:val="26"/>
+          <w:u w:val="single"/>
+          <w:lang w:val="uk-UA"/>
+        </w:rPr>
+      </w:pPr>
+      <w:r>
+        <w:rPr>
+          <w:rFonts w:ascii="Times New Roman" w:eastAsia="Times New Roman" w:hAnsi="Times New Roman" w:cs="Times New Roman"/>
+          <w:color w:val="000000"/>
+          <w:sz w:val="26"/>
+          <w:szCs w:val="26"/>
+          <w:u w:val="single"/>
+        </w:rPr>
+        <w:lastRenderedPageBreak/>
+        <w:t>Висновки:</w:t>
+      </w:r>
+    </w:p>
+    <w:p>
+      <w:pPr>
+        <w:rPr>
+          <w:rFonts w:ascii="Times New Roman" w:eastAsia="Times New Roman" w:hAnsi="Times New Roman" w:cs="Times New Roman"/>
+          <w:color w:val="000000"/>
+          <w:sz w:val="26"/>
+          <w:szCs w:val="26"/>
+          <w:u w:val="single"/>
+          <w:lang w:val="uk-UA"/>
+        </w:rPr>
+      </w:pPr>
+      <w:r>
+        <w:rPr>
+          <w:rFonts w:ascii="Times New Roman" w:eastAsia="Times New Roman" w:hAnsi="Times New Roman" w:cs="Times New Roman"/>
+          <w:color w:val="000000"/>
+          <w:sz w:val="26"/>
+          <w:szCs w:val="26"/>
+          <w:u w:val="single"/>
+          <w:lang w:val="uk-UA"/>
+        </w:rPr>
+        <w:t xml:space="preserve">Друга лабораторна робота виглядала дуже складною, але джерелом складності насправді був мій любий </w:t>
+      </w:r>
+      <w:r>
+        <w:rPr>
+          <w:rFonts w:ascii="Times New Roman" w:eastAsia="Times New Roman" w:hAnsi="Times New Roman" w:cs="Times New Roman"/>
+          <w:color w:val="000000"/>
+          <w:sz w:val="26"/>
+          <w:szCs w:val="26"/>
+          <w:u w:val="single"/>
+        </w:rPr>
+        <w:t>WinApi</w:t>
+      </w:r>
+      <w:r>
+        <w:rPr>
+          <w:rFonts w:ascii="Times New Roman" w:eastAsia="Times New Roman" w:hAnsi="Times New Roman" w:cs="Times New Roman"/>
+          <w:color w:val="000000"/>
+          <w:sz w:val="26"/>
+          <w:szCs w:val="26"/>
+          <w:u w:val="single"/>
+          <w:lang w:val="uk-UA"/>
+        </w:rPr>
+        <w:t>…</w:t>
+      </w:r>
+    </w:p>
+    <w:p>
+      <w:pPr>
+        <w:rPr>
+          <w:rFonts w:ascii="Times New Roman" w:eastAsia="Times New Roman" w:hAnsi="Times New Roman" w:cs="Times New Roman"/>
+          <w:color w:val="000000"/>
+          <w:sz w:val="26"/>
+          <w:szCs w:val="26"/>
+          <w:u w:val="single"/>
+          <w:lang w:val="uk-UA"/>
+        </w:rPr>
+      </w:pPr>
+      <w:r>
+        <w:rPr>
+          <w:rFonts w:ascii="Times New Roman" w:eastAsia="Times New Roman" w:hAnsi="Times New Roman" w:cs="Times New Roman"/>
+          <w:color w:val="000000"/>
+          <w:sz w:val="26"/>
+          <w:szCs w:val="26"/>
+          <w:u w:val="single"/>
+          <w:lang w:val="uk-UA"/>
+        </w:rPr>
+        <w:t xml:space="preserve">Коли я втямив, що для виконання цієї лабораторної достатньо використовувати примітивні функції без особливих складнощів, а всі найскладніші частини було покрито паном Порєвим в його компроматі, сонце почало сяяти сильніше, хмари розійшлись а моє життя стало спокійним. </w:t>
+      </w:r>
+      <w:r>
+        <w:rPr>
+          <w:rFonts w:ascii="Times New Roman" w:eastAsia="Times New Roman" w:hAnsi="Times New Roman" w:cs="Times New Roman"/>
+          <w:color w:val="000000"/>
+          <w:sz w:val="26"/>
+          <w:szCs w:val="26"/>
+          <w:u w:val="single"/>
+          <w:lang w:val="uk-UA"/>
+        </w:rPr>
+        <w:br/>
+        <w:t>При виконанні лаби я використав принцип наслідування, принцип поліморфізму, модульність (в певному обсязі) та загалом зрозумів яким чином робляться оці ваші кнопачкі. Загалом я задоволений результатом, але мені цікаво зробити список об’єктів динамічним та позбутись обмеження намальованих фігур.</w:t>
+      </w:r>
+      <w:r>
+        <w:rPr>
+          <w:rFonts w:ascii="Times New Roman" w:eastAsia="Times New Roman" w:hAnsi="Times New Roman" w:cs="Times New Roman"/>
+          <w:color w:val="000000"/>
+          <w:sz w:val="26"/>
+          <w:szCs w:val="26"/>
+          <w:u w:val="single"/>
+          <w:lang w:val="uk-UA"/>
+        </w:rPr>
+        <w:br/>
+      </w:r>
+      <w:r>
+        <w:rPr>
+          <w:rFonts w:ascii="Times New Roman" w:eastAsia="Times New Roman" w:hAnsi="Times New Roman" w:cs="Times New Roman"/>
+          <w:color w:val="000000"/>
+          <w:sz w:val="26"/>
+          <w:szCs w:val="26"/>
+          <w:u w:val="single"/>
+          <w:lang w:val="uk-UA"/>
+        </w:rPr>
+        <w:t>Найскладнішою частиною виконання лаби було зрозуміти що саме від мене хочуть, звісно це моя проблема, адже саме я обрав виконувати завдання за настановами пана Порєва.</w:t>
+      </w:r>
+      <w:r>
+        <w:rPr>
+          <w:rFonts w:ascii="Times New Roman" w:eastAsia="Times New Roman" w:hAnsi="Times New Roman" w:cs="Times New Roman"/>
+          <w:color w:val="000000"/>
+          <w:sz w:val="26"/>
+          <w:szCs w:val="26"/>
+          <w:u w:val="single"/>
+          <w:lang w:val="uk-UA"/>
+        </w:rPr>
+        <w:br/>
+      </w:r>
+      <w:r>
+        <w:rPr>
+          <w:rFonts w:ascii="Times New Roman" w:eastAsia="Times New Roman" w:hAnsi="Times New Roman" w:cs="Times New Roman"/>
+          <w:color w:val="000000"/>
+          <w:sz w:val="26"/>
+          <w:szCs w:val="26"/>
+          <w:u w:val="single"/>
+          <w:lang w:val="uk-UA"/>
+        </w:rPr>
+        <w:br/>
+      </w:r>
+      <w:r>
+        <w:rPr>
+          <w:rFonts w:ascii="Times New Roman" w:eastAsia="Times New Roman" w:hAnsi="Times New Roman" w:cs="Times New Roman"/>
+          <w:color w:val="000000"/>
+          <w:sz w:val="26"/>
+          <w:szCs w:val="26"/>
+          <w:u w:val="single"/>
+        </w:rPr>
+        <w:t xml:space="preserve">P.S. </w:t>
+      </w:r>
+      <w:r>
+        <w:rPr>
+          <w:rFonts w:ascii="Times New Roman" w:eastAsia="Times New Roman" w:hAnsi="Times New Roman" w:cs="Times New Roman"/>
+          <w:color w:val="000000"/>
+          <w:sz w:val="26"/>
+          <w:szCs w:val="26"/>
+          <w:u w:val="single"/>
+          <w:lang w:val="uk-UA"/>
+        </w:rPr>
+        <w:t>Прошу вибачення, що трішки відхилився від свого варіанту по кольорам, але моя душа естета не могла б винести оранджевих прямокутників в комбінації з рожевими овалами по дефолту без можливості змінити колір.</w:t>
+      </w:r>
+      <w:r>
+        <w:rPr>
+          <w:rFonts w:ascii="Times New Roman" w:eastAsia="Times New Roman" w:hAnsi="Times New Roman" w:cs="Times New Roman"/>
+          <w:color w:val="000000"/>
+          <w:sz w:val="26"/>
+          <w:szCs w:val="26"/>
+          <w:u w:val="single"/>
+          <w:lang w:val="uk-UA"/>
+        </w:rPr>
+        <w:br/>
+        <w:t>Я поки не уявляю яким чином програмувати палітру і мені страшно від того що на мене очікує, але я буду крокувати в майбутнє з високо задертим носом та впевненістю.</w:t>
       </w:r>
     </w:p>
     <w:sectPr>
@@ -2475,7 +3372,6 @@
   <w:style w:type="character" w:default="1" w:styleId="a0">
     <w:name w:val="Default Paragraph Font"/>
     <w:uiPriority w:val="1"/>
-    <w:semiHidden/>
     <w:unhideWhenUsed/>
   </w:style>
   <w:style w:type="table" w:default="1" w:styleId="a1">
@@ -2546,6 +3442,41 @@
     <w:pPr>
       <w:suppressLineNumbers/>
     </w:pPr>
+  </w:style>
+  <w:style w:type="character" w:styleId="a8">
+    <w:name w:val="Hyperlink"/>
+    <w:basedOn w:val="a0"/>
+    <w:uiPriority w:val="99"/>
+    <w:unhideWhenUsed/>
+    <w:rsid w:val="007123A6"/>
+    <w:rPr>
+      <w:color w:val="0000EE" w:themeColor="hyperlink"/>
+      <w:u w:val="single"/>
+    </w:rPr>
+  </w:style>
+  <w:style w:type="character" w:styleId="a9">
+    <w:name w:val="Unresolved Mention"/>
+    <w:basedOn w:val="a0"/>
+    <w:uiPriority w:val="99"/>
+    <w:semiHidden/>
+    <w:unhideWhenUsed/>
+    <w:rsid w:val="007123A6"/>
+    <w:rPr>
+      <w:color w:val="605E5C"/>
+      <w:shd w:val="clear" w:color="auto" w:fill="E1DFDD"/>
+    </w:rPr>
+  </w:style>
+  <w:style w:type="character" w:styleId="aa">
+    <w:name w:val="FollowedHyperlink"/>
+    <w:basedOn w:val="a0"/>
+    <w:uiPriority w:val="99"/>
+    <w:semiHidden/>
+    <w:unhideWhenUsed/>
+    <w:rsid w:val="007123A6"/>
+    <w:rPr>
+      <w:color w:val="551A8B" w:themeColor="followedHyperlink"/>
+      <w:u w:val="single"/>
+    </w:rPr>
   </w:style>
 </w:styles>
 </file>

</xml_diff>

<commit_message>
feat(documentation): add class diagram and screenshots to the report
</commit_message>
<xml_diff>
--- a/Лаб2_IМ54_Бондаренко.docx
+++ b/Лаб2_IМ54_Бондаренко.docx
@@ -15833,6 +15833,150 @@
           <w:color w:val="000000"/>
           <w:sz w:val="8"/>
           <w:szCs w:val="8"/>
+          <w:u w:val="single"/>
+          <w:lang w:val="uk-UA"/>
+        </w:rPr>
+        <w:br w:type="page"/>
+      </w:r>
+    </w:p>
+    <w:p>
+      <w:pPr>
+        <w:rPr>
+          <w:rFonts w:ascii="Times New Roman" w:eastAsia="Times New Roman" w:hAnsi="Times New Roman" w:cs="Times New Roman"/>
+          <w:b/>
+          <w:bCs/>
+          <w:color w:val="000000"/>
+          <w:sz w:val="40"/>
+          <w:szCs w:val="40"/>
+          <w:u w:val="single"/>
+          <w:lang w:val="uk-UA"/>
+        </w:rPr>
+      </w:pPr>
+      <w:r>
+        <w:rPr>
+          <w:rFonts w:ascii="Times New Roman" w:eastAsia="Times New Roman" w:hAnsi="Times New Roman" w:cs="Times New Roman"/>
+          <w:b/>
+          <w:bCs/>
+          <w:color w:val="000000"/>
+          <w:sz w:val="40"/>
+          <w:szCs w:val="40"/>
+          <w:u w:val="single"/>
+          <w:lang w:val="uk-UA"/>
+        </w:rPr>
+        <w:lastRenderedPageBreak/>
+        <w:t>Діаграма класів:</w:t>
+      </w:r>
+      <w:r>
+        <w:rPr>
+          <w:rFonts w:ascii="Times New Roman" w:eastAsia="Times New Roman" w:hAnsi="Times New Roman" w:cs="Times New Roman"/>
+          <w:b/>
+          <w:bCs/>
+          <w:color w:val="000000"/>
+          <w:sz w:val="40"/>
+          <w:szCs w:val="40"/>
+          <w:u w:val="single"/>
+          <w:lang w:val="uk-UA"/>
+        </w:rPr>
+        <w:br/>
+      </w:r>
+      <w:r>
+        <w:rPr>
+          <w:noProof/>
+        </w:rPr>
+        <w:drawing>
+          <wp:anchor distT="0" distB="0" distL="114300" distR="114300" simplePos="0" relativeHeight="251658240" behindDoc="0" locked="0" layoutInCell="1" allowOverlap="1" wp14:anchorId="52F8BCF9" wp14:editId="39C9F942">
+            <wp:simplePos x="0" y="0"/>
+            <wp:positionH relativeFrom="column">
+              <wp:posOffset>0</wp:posOffset>
+            </wp:positionH>
+            <wp:positionV relativeFrom="paragraph">
+              <wp:posOffset>295275</wp:posOffset>
+            </wp:positionV>
+            <wp:extent cx="5943600" cy="4933950"/>
+            <wp:effectExtent l="0" t="0" r="0" b="0"/>
+            <wp:wrapThrough wrapText="bothSides">
+              <wp:wrapPolygon edited="0">
+                <wp:start x="0" y="0"/>
+                <wp:lineTo x="0" y="21517"/>
+                <wp:lineTo x="21531" y="21517"/>
+                <wp:lineTo x="21531" y="0"/>
+                <wp:lineTo x="0" y="0"/>
+              </wp:wrapPolygon>
+            </wp:wrapThrough>
+            <wp:docPr id="1" name="Рисунок 1"/>
+            <wp:cNvGraphicFramePr>
+              <a:graphicFrameLocks xmlns:a="http://schemas.openxmlformats.org/drawingml/2006/main" noChangeAspect="1"/>
+            </wp:cNvGraphicFramePr>
+            <a:graphic xmlns:a="http://schemas.openxmlformats.org/drawingml/2006/main">
+              <a:graphicData uri="http://schemas.openxmlformats.org/drawingml/2006/picture">
+                <pic:pic xmlns:pic="http://schemas.openxmlformats.org/drawingml/2006/picture">
+                  <pic:nvPicPr>
+                    <pic:cNvPr id="0" name="Picture 1"/>
+                    <pic:cNvPicPr>
+                      <a:picLocks noChangeAspect="1" noChangeArrowheads="1"/>
+                    </pic:cNvPicPr>
+                  </pic:nvPicPr>
+                  <pic:blipFill>
+                    <a:blip r:embed="rId5" cstate="print">
+                      <a:extLst>
+                        <a:ext uri="{28A0092B-C50C-407E-A947-70E740481C1C}">
+                          <a14:useLocalDpi xmlns:a14="http://schemas.microsoft.com/office/drawing/2010/main" val="0"/>
+                        </a:ext>
+                      </a:extLst>
+                    </a:blip>
+                    <a:srcRect/>
+                    <a:stretch>
+                      <a:fillRect/>
+                    </a:stretch>
+                  </pic:blipFill>
+                  <pic:spPr bwMode="auto">
+                    <a:xfrm>
+                      <a:off x="0" y="0"/>
+                      <a:ext cx="5943600" cy="4933950"/>
+                    </a:xfrm>
+                    <a:prstGeom prst="rect">
+                      <a:avLst/>
+                    </a:prstGeom>
+                    <a:noFill/>
+                    <a:ln>
+                      <a:noFill/>
+                    </a:ln>
+                  </pic:spPr>
+                </pic:pic>
+              </a:graphicData>
+            </a:graphic>
+            <wp14:sizeRelH relativeFrom="page">
+              <wp14:pctWidth>0</wp14:pctWidth>
+            </wp14:sizeRelH>
+            <wp14:sizeRelV relativeFrom="page">
+              <wp14:pctHeight>0</wp14:pctHeight>
+            </wp14:sizeRelV>
+          </wp:anchor>
+        </w:drawing>
+      </w:r>
+    </w:p>
+    <w:p>
+      <w:pPr>
+        <w:widowControl/>
+        <w:rPr>
+          <w:rFonts w:ascii="Times New Roman" w:eastAsia="Times New Roman" w:hAnsi="Times New Roman" w:cs="Times New Roman"/>
+          <w:b/>
+          <w:bCs/>
+          <w:color w:val="000000"/>
+          <w:sz w:val="40"/>
+          <w:szCs w:val="40"/>
+          <w:u w:val="single"/>
+          <w:lang w:val="uk-UA"/>
+        </w:rPr>
+      </w:pPr>
+      <w:r>
+        <w:rPr>
+          <w:rFonts w:ascii="Times New Roman" w:eastAsia="Times New Roman" w:hAnsi="Times New Roman" w:cs="Times New Roman"/>
+          <w:b/>
+          <w:bCs/>
+          <w:color w:val="000000"/>
+          <w:sz w:val="40"/>
+          <w:szCs w:val="40"/>
           <w:u w:val="single"/>
           <w:lang w:val="uk-UA"/>
         </w:rPr>
@@ -15904,7 +16048,7 @@
                     </pic:cNvPicPr>
                   </pic:nvPicPr>
                   <pic:blipFill>
-                    <a:blip r:embed="rId5">
+                    <a:blip r:embed="rId6">
                       <a:extLst>
                         <a:ext uri="{28A0092B-C50C-407E-A947-70E740481C1C}">
                           <a14:useLocalDpi xmlns:a14="http://schemas.microsoft.com/office/drawing/2010/main" val="0"/>
@@ -15963,7 +16107,7 @@
                     </pic:cNvPicPr>
                   </pic:nvPicPr>
                   <pic:blipFill>
-                    <a:blip r:embed="rId6">
+                    <a:blip r:embed="rId7">
                       <a:extLst>
                         <a:ext uri="{28A0092B-C50C-407E-A947-70E740481C1C}">
                           <a14:useLocalDpi xmlns:a14="http://schemas.microsoft.com/office/drawing/2010/main" val="0"/>
@@ -16022,7 +16166,7 @@
                     </pic:cNvPicPr>
                   </pic:nvPicPr>
                   <pic:blipFill>
-                    <a:blip r:embed="rId7">
+                    <a:blip r:embed="rId8">
                       <a:extLst>
                         <a:ext uri="{28A0092B-C50C-407E-A947-70E740481C1C}">
                           <a14:useLocalDpi xmlns:a14="http://schemas.microsoft.com/office/drawing/2010/main" val="0"/>
@@ -16081,7 +16225,7 @@
                     </pic:cNvPicPr>
                   </pic:nvPicPr>
                   <pic:blipFill>
-                    <a:blip r:embed="rId8">
+                    <a:blip r:embed="rId9">
                       <a:extLst>
                         <a:ext uri="{28A0092B-C50C-407E-A947-70E740481C1C}">
                           <a14:useLocalDpi xmlns:a14="http://schemas.microsoft.com/office/drawing/2010/main" val="0"/>
@@ -16140,7 +16284,7 @@
                     </pic:cNvPicPr>
                   </pic:nvPicPr>
                   <pic:blipFill>
-                    <a:blip r:embed="rId9">
+                    <a:blip r:embed="rId10">
                       <a:extLst>
                         <a:ext uri="{28A0092B-C50C-407E-A947-70E740481C1C}">
                           <a14:useLocalDpi xmlns:a14="http://schemas.microsoft.com/office/drawing/2010/main" val="0"/>
@@ -16199,7 +16343,7 @@
                     </pic:cNvPicPr>
                   </pic:nvPicPr>
                   <pic:blipFill>
-                    <a:blip r:embed="rId10">
+                    <a:blip r:embed="rId11">
                       <a:extLst>
                         <a:ext uri="{28A0092B-C50C-407E-A947-70E740481C1C}">
                           <a14:useLocalDpi xmlns:a14="http://schemas.microsoft.com/office/drawing/2010/main" val="0"/>
@@ -16258,7 +16402,7 @@
                     </pic:cNvPicPr>
                   </pic:nvPicPr>
                   <pic:blipFill>
-                    <a:blip r:embed="rId11">
+                    <a:blip r:embed="rId12">
                       <a:extLst>
                         <a:ext uri="{28A0092B-C50C-407E-A947-70E740481C1C}">
                           <a14:useLocalDpi xmlns:a14="http://schemas.microsoft.com/office/drawing/2010/main" val="0"/>
@@ -16317,7 +16461,7 @@
                     </pic:cNvPicPr>
                   </pic:nvPicPr>
                   <pic:blipFill>
-                    <a:blip r:embed="rId12">
+                    <a:blip r:embed="rId13">
                       <a:extLst>
                         <a:ext uri="{28A0092B-C50C-407E-A947-70E740481C1C}">
                           <a14:useLocalDpi xmlns:a14="http://schemas.microsoft.com/office/drawing/2010/main" val="0"/>
@@ -16376,7 +16520,7 @@
                     </pic:cNvPicPr>
                   </pic:nvPicPr>
                   <pic:blipFill>
-                    <a:blip r:embed="rId13">
+                    <a:blip r:embed="rId14">
                       <a:extLst>
                         <a:ext uri="{28A0092B-C50C-407E-A947-70E740481C1C}">
                           <a14:useLocalDpi xmlns:a14="http://schemas.microsoft.com/office/drawing/2010/main" val="0"/>
@@ -17029,6 +17173,7 @@
   <w:style w:type="character" w:default="1" w:styleId="a0">
     <w:name w:val="Default Paragraph Font"/>
     <w:uiPriority w:val="1"/>
+    <w:semiHidden/>
     <w:unhideWhenUsed/>
   </w:style>
   <w:style w:type="table" w:default="1" w:styleId="a1">

</xml_diff>